<commit_message>
update docx and pdf with latest wording changes
</commit_message>
<xml_diff>
--- a/manuscript_round3_blinded.docx
+++ b/manuscript_round3_blinded.docx
@@ -674,7 +674,7 @@
         <w:t xml:space="preserve"> </w:t>
       </w:r>
       <w:r>
-        <w:t xml:space="preserve">EFR extends an existing DCE with constrained narrative-policy evaluation by assigning most of the weight to the empirical reference; the fixed</w:t>
+        <w:t xml:space="preserve">EFR provides a constrained mechanism for applying an existing DCE-derived frontier to narrative-policy evaluation by assigning most of the weight to the empirical reference; the fixed</w:t>
       </w:r>
       <w:r>
         <w:t xml:space="preserve"> </w:t>
@@ -817,7 +817,7 @@
         </w:numPr>
       </w:pPr>
       <w:r>
-        <w:t xml:space="preserve">We show that the proposed adjustment improves behavioral reliability across multiple LLMs, reducing behavioral inconsistencies, improving agreement with the empirical choice frontier, and improving probability calibration relative to unconstrained LLM agents.</w:t>
+        <w:t xml:space="preserve">We show that the proposed adjustment improves behavioral reliability across multiple LLMs, reducing behavioral inconsistencies, improving agreement with the empirical choice frontier, and improving held-out probabilistic prediction relative to unconstrained LLM agents.</w:t>
       </w:r>
     </w:p>
     <w:p>
@@ -886,7 +886,10 @@
         <w:t xml:space="preserve">, sponsor–HTA conversation simulation </w:t>
       </w:r>
       <w:r>
-        <w:t xml:space="preserve">, and microsimulation </w:t>
+        <w:t xml:space="preserve">, microsimulation </w:t>
+      </w:r>
+      <w:r>
+        <w:t xml:space="preserve">, and LLM-based prediction of stated preferences </w:t>
       </w:r>
       <w:r>
         <w:t xml:space="preserve">. We deploy LLMs as narrative-extension mechanisms anchored to a DCE-derived empirical frontier, not as tools for review or negotiation. The closest analogue outside HTA is Twin-2K-500 </w:t>
@@ -5597,7 +5600,7 @@
         <w:t xml:space="preserve">First</w:t>
       </w:r>
       <w:r>
-        <w:t xml:space="preserve">, a recent DCE unlocks a low-marginal-cost narrative-policy simulation pipeline: HTA agencies need only the LLM API, DCE estimates, and a deterministic blend. This is most valuable for early-stage policy screening (e.g., new vaccine reimbursement tiers) where new DCE cost is prohibitive.</w:t>
+        <w:t xml:space="preserve">, a recent DCE unlocks a low-marginal-cost narrative-policy simulation pipeline: HTA agencies need only the LLM API, DCE estimates, and a deterministic blend. This may be useful for exploratory screening when immediate collection of a new DCE is impractical.</w:t>
       </w:r>
       <w:r>
         <w:t xml:space="preserve"> </w:t>
@@ -5660,7 +5663,7 @@
           <w:rPr>
             <w:rStyle w:val="Hyperlink"/>
           </w:rPr>
-          <w:t xml:space="preserve">https://github.com/REDACTED/behavioral-digital-twins</w:t>
+          <w:t xml:space="preserve">https://github.com/yichao2022/behavioral-digital-twins</w:t>
         </w:r>
       </w:hyperlink>
       <w:r>
@@ -8284,7 +8287,7 @@
           <w:rPr>
             <w:rStyle w:val="Hyperlink"/>
           </w:rPr>
-          <w:t xml:space="preserve">https://github.com/REDACTED/behavioral-digital-twins</w:t>
+          <w:t xml:space="preserve">https://github.com/yichao2022/behavioral-digital-twins</w:t>
         </w:r>
       </w:hyperlink>
       <w:r>

</xml_diff>